<commit_message>
Cover letter: remove sentence on the other manuscript (author decision)
Co-Authored-By: Claude Opus 5.5 <noreply@anthropic.com>
Claude-Session: https://claude.ai/code/session_01DV1FpN7pyDPdia8AQncgwU
</commit_message>
<xml_diff>
--- a/submission/JFIP_submission/06_Cover_Letter.docx
+++ b/submission/JFIP_submission/06_Cover_Letter.docx
@@ -85,16 +85,6 @@
       <w:r>
         <w:rPr/>
         <w:t>The paper asks whether the first ESG score that a rating provider assigns to a listed firm changes how the equity market values that firm. Using the staggered first appearance of LSEG ESG scores for 675 non-financial firms in Indonesia, Malaysia, the Philippines, Singapore, and Thailand, and heterogeneity-robust difference-in-differences estimators, we find that scored firms gained value faster than comparable firms before their first scored year and, under parallel trends, did not gain in market-to-book ratio afterwards. A static two-way fixed effects regression on the same data would instead attribute a valuation gain of 6.6 percent to coverage. We registered the hypotheses, sample rules, estimator, and robustness checks in a pre-analysis plan before estimation and report all pre-specified results, including a placebo test that fails.</w:t>
-      </w:r>
-    </w:p>
-    <w:p>
-      <w:pPr>
-        <w:spacing w:line="360" w:lineRule="auto" w:after="120" w:before="0"/>
-        <w:jc w:val="both"/>
-      </w:pPr>
-      <w:r>
-        <w:rPr/>
-        <w:t>The data set also underlies another manuscript by the same authors, currently under review at the International Journal of Management and Sustainability, which addresses a different research question with different variables and methods.</w:t>
       </w:r>
     </w:p>
     <w:p>

</xml_diff>